<commit_message>
test: execute lab report checks and harden migrations
Co-authored-by: Copilot <223556219+Copilot@users.noreply.github.com>
</commit_message>
<xml_diff>
--- a/Software_Testing_Lab_6_Report_With_Screenshot_Placeholders.docx
+++ b/Software_Testing_Lab_6_Report_With_Screenshot_Placeholders.docx
@@ -1853,21 +1853,8 @@
             </w:tcMar>
           </w:tcPr>
           <w:p>
-            <w:pPr>
-              <w:spacing w:after="0" w:line="240" w:lineRule="auto"/>
-            </w:pPr>
-            <w:r>
-              <w:rPr>
-                <w:rFonts w:ascii="Consolas" w:hAnsi="Consolas"/>
-                <w:sz w:val="16"/>
-              </w:rPr>
-              <w:t>npm run lint</w:t>
-            </w:r>
-            <w:r>
-              <w:rPr>
-                <w:sz w:val="16"/>
-              </w:rPr>
-              <w:t xml:space="preserve"> completed with no lint diagnostics.</w:t>
+            <w:r>
+              <w:t>npm run lint failed because the existing client tree contains 122 lint errors (mostly explicit any rules) and one generated .vite rule reference.</w:t>
             </w:r>
           </w:p>
         </w:tc>
@@ -1883,14 +1870,8 @@
             </w:tcMar>
           </w:tcPr>
           <w:p>
-            <w:pPr>
-              <w:spacing w:after="0" w:line="240" w:lineRule="auto"/>
-            </w:pPr>
-            <w:r>
-              <w:rPr>
-                <w:sz w:val="16"/>
-              </w:rPr>
-              <w:t>Pass</w:t>
+            <w:r>
+              <w:t>Fail (pre-existing lint debt; build/type-check passes)</w:t>
             </w:r>
           </w:p>
         </w:tc>
@@ -2115,14 +2096,8 @@
             </w:tcMar>
           </w:tcPr>
           <w:p>
-            <w:pPr>
-              <w:spacing w:after="0" w:line="240" w:lineRule="auto"/>
-            </w:pPr>
-            <w:r>
-              <w:rPr>
-                <w:sz w:val="16"/>
-              </w:rPr>
-              <w:t>Laravel resolved the implemented API routes and their middleware.</w:t>
+            <w:r>
+              <w:t>php artisan route:list --path=api completed; critical API routes resolved, and the unauthenticated About update route was removed during this test.</w:t>
             </w:r>
           </w:p>
         </w:tc>
@@ -16432,22 +16407,47 @@
               <w:spacing w:before="120"/>
               <w:jc w:val="center"/>
             </w:pPr>
-            <w:r>
-              <w:br/>
-              <w:br/>
-              <w:br/>
-            </w:r>
+            <w:r/>
             <w:r>
               <w:rPr>
                 <w:b/>
                 <w:color w:val="595959"/>
               </w:rPr>
-              <w:t>[Insert Screenshot Here  SS-01]</w:t>
-            </w:r>
-            <w:r>
-              <w:br/>
-              <w:br/>
-              <w:br/>
+            </w:r>
+            <w:r/>
+            <w:r>
+              <w:drawing>
+                <wp:inline xmlns:a="http://schemas.openxmlformats.org/drawingml/2006/main" xmlns:pic="http://schemas.openxmlformats.org/drawingml/2006/picture">
+                  <wp:extent cx="5669280" cy="38196774"/>
+                  <wp:docPr id="1" name="Picture 1"/>
+                  <wp:cNvGraphicFramePr>
+                    <a:graphicFrameLocks noChangeAspect="1"/>
+                  </wp:cNvGraphicFramePr>
+                  <a:graphic>
+                    <a:graphicData uri="http://schemas.openxmlformats.org/drawingml/2006/picture">
+                      <pic:pic>
+                        <pic:nvPicPr>
+                          <pic:cNvPr id="0" name="SS-01_Home.png"/>
+                          <pic:cNvPicPr/>
+                        </pic:nvPicPr>
+                        <pic:blipFill>
+                          <a:blip r:embed="rId10"/>
+                          <a:stretch>
+                            <a:fillRect/>
+                          </a:stretch>
+                        </pic:blipFill>
+                        <pic:spPr>
+                          <a:xfrm>
+                            <a:off x="0" y="0"/>
+                            <a:ext cx="5669280" cy="38196774"/>
+                          </a:xfrm>
+                          <a:prstGeom prst="rect"/>
+                        </pic:spPr>
+                      </pic:pic>
+                    </a:graphicData>
+                  </a:graphic>
+                </wp:inline>
+              </w:drawing>
             </w:r>
           </w:p>
         </w:tc>
@@ -16517,22 +16517,47 @@
               <w:spacing w:before="120"/>
               <w:jc w:val="center"/>
             </w:pPr>
-            <w:r>
-              <w:br/>
-              <w:br/>
-              <w:br/>
-            </w:r>
+            <w:r/>
             <w:r>
               <w:rPr>
                 <w:b/>
                 <w:color w:val="595959"/>
               </w:rPr>
-              <w:t>[Insert Screenshot Here  SS-02]</w:t>
-            </w:r>
-            <w:r>
-              <w:br/>
-              <w:br/>
-              <w:br/>
+            </w:r>
+            <w:r/>
+            <w:r>
+              <w:drawing>
+                <wp:inline xmlns:a="http://schemas.openxmlformats.org/drawingml/2006/main" xmlns:pic="http://schemas.openxmlformats.org/drawingml/2006/picture">
+                  <wp:extent cx="5669280" cy="5759831"/>
+                  <wp:docPr id="2" name="Picture 2"/>
+                  <wp:cNvGraphicFramePr>
+                    <a:graphicFrameLocks noChangeAspect="1"/>
+                  </wp:cNvGraphicFramePr>
+                  <a:graphic>
+                    <a:graphicData uri="http://schemas.openxmlformats.org/drawingml/2006/picture">
+                      <pic:pic>
+                        <pic:nvPicPr>
+                          <pic:cNvPr id="0" name="SS-02_Invalid_Registration.png"/>
+                          <pic:cNvPicPr/>
+                        </pic:nvPicPr>
+                        <pic:blipFill>
+                          <a:blip r:embed="rId11"/>
+                          <a:stretch>
+                            <a:fillRect/>
+                          </a:stretch>
+                        </pic:blipFill>
+                        <pic:spPr>
+                          <a:xfrm>
+                            <a:off x="0" y="0"/>
+                            <a:ext cx="5669280" cy="5759831"/>
+                          </a:xfrm>
+                          <a:prstGeom prst="rect"/>
+                        </pic:spPr>
+                      </pic:pic>
+                    </a:graphicData>
+                  </a:graphic>
+                </wp:inline>
+              </w:drawing>
             </w:r>
           </w:p>
         </w:tc>
@@ -17112,22 +17137,47 @@
               <w:spacing w:before="120"/>
               <w:jc w:val="center"/>
             </w:pPr>
-            <w:r>
-              <w:br/>
-              <w:br/>
-              <w:br/>
-            </w:r>
+            <w:r/>
             <w:r>
               <w:rPr>
                 <w:b/>
                 <w:color w:val="595959"/>
               </w:rPr>
-              <w:t>[Insert Screenshot Here  SS-09]</w:t>
-            </w:r>
-            <w:r>
-              <w:br/>
-              <w:br/>
-              <w:br/>
+            </w:r>
+            <w:r/>
+            <w:r>
+              <w:drawing>
+                <wp:inline xmlns:a="http://schemas.openxmlformats.org/drawingml/2006/main" xmlns:pic="http://schemas.openxmlformats.org/drawingml/2006/picture">
+                  <wp:extent cx="5669280" cy="5759831"/>
+                  <wp:docPr id="3" name="Picture 3"/>
+                  <wp:cNvGraphicFramePr>
+                    <a:graphicFrameLocks noChangeAspect="1"/>
+                  </wp:cNvGraphicFramePr>
+                  <a:graphic>
+                    <a:graphicData uri="http://schemas.openxmlformats.org/drawingml/2006/picture">
+                      <pic:pic>
+                        <pic:nvPicPr>
+                          <pic:cNvPr id="0" name="SS-03_Prayer_Times.png"/>
+                          <pic:cNvPicPr/>
+                        </pic:nvPicPr>
+                        <pic:blipFill>
+                          <a:blip r:embed="rId12"/>
+                          <a:stretch>
+                            <a:fillRect/>
+                          </a:stretch>
+                        </pic:blipFill>
+                        <pic:spPr>
+                          <a:xfrm>
+                            <a:off x="0" y="0"/>
+                            <a:ext cx="5669280" cy="5759831"/>
+                          </a:xfrm>
+                          <a:prstGeom prst="rect"/>
+                        </pic:spPr>
+                      </pic:pic>
+                    </a:graphicData>
+                  </a:graphic>
+                </wp:inline>
+              </w:drawing>
             </w:r>
           </w:p>
         </w:tc>
@@ -17282,22 +17332,47 @@
               <w:spacing w:before="120"/>
               <w:jc w:val="center"/>
             </w:pPr>
-            <w:r>
-              <w:br/>
-              <w:br/>
-              <w:br/>
-            </w:r>
+            <w:r/>
             <w:r>
               <w:rPr>
                 <w:b/>
                 <w:color w:val="595959"/>
               </w:rPr>
-              <w:t>[Insert Screenshot Here  SS-11]</w:t>
-            </w:r>
-            <w:r>
-              <w:br/>
-              <w:br/>
-              <w:br/>
+            </w:r>
+            <w:r/>
+            <w:r>
+              <w:drawing>
+                <wp:inline xmlns:a="http://schemas.openxmlformats.org/drawingml/2006/main" xmlns:pic="http://schemas.openxmlformats.org/drawingml/2006/picture">
+                  <wp:extent cx="5669280" cy="5759831"/>
+                  <wp:docPr id="4" name="Picture 4"/>
+                  <wp:cNvGraphicFramePr>
+                    <a:graphicFrameLocks noChangeAspect="1"/>
+                  </wp:cNvGraphicFramePr>
+                  <a:graphic>
+                    <a:graphicData uri="http://schemas.openxmlformats.org/drawingml/2006/picture">
+                      <pic:pic>
+                        <pic:nvPicPr>
+                          <pic:cNvPr id="0" name="SS-04_Activities.png"/>
+                          <pic:cNvPicPr/>
+                        </pic:nvPicPr>
+                        <pic:blipFill>
+                          <a:blip r:embed="rId13"/>
+                          <a:stretch>
+                            <a:fillRect/>
+                          </a:stretch>
+                        </pic:blipFill>
+                        <pic:spPr>
+                          <a:xfrm>
+                            <a:off x="0" y="0"/>
+                            <a:ext cx="5669280" cy="5759831"/>
+                          </a:xfrm>
+                          <a:prstGeom prst="rect"/>
+                        </pic:spPr>
+                      </pic:pic>
+                    </a:graphicData>
+                  </a:graphic>
+                </wp:inline>
+              </w:drawing>
             </w:r>
           </w:p>
         </w:tc>
@@ -17537,22 +17612,47 @@
               <w:spacing w:before="120"/>
               <w:jc w:val="center"/>
             </w:pPr>
-            <w:r>
-              <w:br/>
-              <w:br/>
-              <w:br/>
-            </w:r>
+            <w:r/>
             <w:r>
               <w:rPr>
                 <w:b/>
                 <w:color w:val="595959"/>
               </w:rPr>
-              <w:t>[Insert Screenshot Here  SS-14]</w:t>
-            </w:r>
-            <w:r>
-              <w:br/>
-              <w:br/>
-              <w:br/>
+            </w:r>
+            <w:r/>
+            <w:r>
+              <w:drawing>
+                <wp:inline xmlns:a="http://schemas.openxmlformats.org/drawingml/2006/main" xmlns:pic="http://schemas.openxmlformats.org/drawingml/2006/picture">
+                  <wp:extent cx="5669280" cy="6555105"/>
+                  <wp:docPr id="5" name="Picture 5"/>
+                  <wp:cNvGraphicFramePr>
+                    <a:graphicFrameLocks noChangeAspect="1"/>
+                  </wp:cNvGraphicFramePr>
+                  <a:graphic>
+                    <a:graphicData uri="http://schemas.openxmlformats.org/drawingml/2006/picture">
+                      <pic:pic>
+                        <pic:nvPicPr>
+                          <pic:cNvPr id="0" name="SS-05_Events.png"/>
+                          <pic:cNvPicPr/>
+                        </pic:nvPicPr>
+                        <pic:blipFill>
+                          <a:blip r:embed="rId14"/>
+                          <a:stretch>
+                            <a:fillRect/>
+                          </a:stretch>
+                        </pic:blipFill>
+                        <pic:spPr>
+                          <a:xfrm>
+                            <a:off x="0" y="0"/>
+                            <a:ext cx="5669280" cy="6555105"/>
+                          </a:xfrm>
+                          <a:prstGeom prst="rect"/>
+                        </pic:spPr>
+                      </pic:pic>
+                    </a:graphicData>
+                  </a:graphic>
+                </wp:inline>
+              </w:drawing>
             </w:r>
           </w:p>
         </w:tc>
@@ -17792,22 +17892,47 @@
               <w:spacing w:before="120"/>
               <w:jc w:val="center"/>
             </w:pPr>
-            <w:r>
-              <w:br/>
-              <w:br/>
-              <w:br/>
-            </w:r>
+            <w:r/>
             <w:r>
               <w:rPr>
                 <w:b/>
                 <w:color w:val="595959"/>
               </w:rPr>
-              <w:t>[Insert Screenshot Here  SS-17]</w:t>
-            </w:r>
-            <w:r>
-              <w:br/>
-              <w:br/>
-              <w:br/>
+            </w:r>
+            <w:r/>
+            <w:r>
+              <w:drawing>
+                <wp:inline xmlns:a="http://schemas.openxmlformats.org/drawingml/2006/main" xmlns:pic="http://schemas.openxmlformats.org/drawingml/2006/picture">
+                  <wp:extent cx="5669280" cy="7728331"/>
+                  <wp:docPr id="6" name="Picture 6"/>
+                  <wp:cNvGraphicFramePr>
+                    <a:graphicFrameLocks noChangeAspect="1"/>
+                  </wp:cNvGraphicFramePr>
+                  <a:graphic>
+                    <a:graphicData uri="http://schemas.openxmlformats.org/drawingml/2006/picture">
+                      <pic:pic>
+                        <pic:nvPicPr>
+                          <pic:cNvPr id="0" name="SS-06_Zakat.png"/>
+                          <pic:cNvPicPr/>
+                        </pic:nvPicPr>
+                        <pic:blipFill>
+                          <a:blip r:embed="rId15"/>
+                          <a:stretch>
+                            <a:fillRect/>
+                          </a:stretch>
+                        </pic:blipFill>
+                        <pic:spPr>
+                          <a:xfrm>
+                            <a:off x="0" y="0"/>
+                            <a:ext cx="5669280" cy="7728331"/>
+                          </a:xfrm>
+                          <a:prstGeom prst="rect"/>
+                        </pic:spPr>
+                      </pic:pic>
+                    </a:graphicData>
+                  </a:graphic>
+                </wp:inline>
+              </w:drawing>
             </w:r>
           </w:p>
         </w:tc>
@@ -17877,22 +18002,47 @@
               <w:spacing w:before="120"/>
               <w:jc w:val="center"/>
             </w:pPr>
-            <w:r>
-              <w:br/>
-              <w:br/>
-              <w:br/>
-            </w:r>
+            <w:r/>
             <w:r>
               <w:rPr>
                 <w:b/>
                 <w:color w:val="595959"/>
               </w:rPr>
-              <w:t>[Insert Screenshot Here  SS-18]</w:t>
-            </w:r>
-            <w:r>
-              <w:br/>
-              <w:br/>
-              <w:br/>
+            </w:r>
+            <w:r/>
+            <w:r>
+              <w:drawing>
+                <wp:inline xmlns:a="http://schemas.openxmlformats.org/drawingml/2006/main" xmlns:pic="http://schemas.openxmlformats.org/drawingml/2006/picture">
+                  <wp:extent cx="5669280" cy="5759831"/>
+                  <wp:docPr id="7" name="Picture 7"/>
+                  <wp:cNvGraphicFramePr>
+                    <a:graphicFrameLocks noChangeAspect="1"/>
+                  </wp:cNvGraphicFramePr>
+                  <a:graphic>
+                    <a:graphicData uri="http://schemas.openxmlformats.org/drawingml/2006/picture">
+                      <pic:pic>
+                        <pic:nvPicPr>
+                          <pic:cNvPr id="0" name="SS-07_Donate.png"/>
+                          <pic:cNvPicPr/>
+                        </pic:nvPicPr>
+                        <pic:blipFill>
+                          <a:blip r:embed="rId16"/>
+                          <a:stretch>
+                            <a:fillRect/>
+                          </a:stretch>
+                        </pic:blipFill>
+                        <pic:spPr>
+                          <a:xfrm>
+                            <a:off x="0" y="0"/>
+                            <a:ext cx="5669280" cy="5759831"/>
+                          </a:xfrm>
+                          <a:prstGeom prst="rect"/>
+                        </pic:spPr>
+                      </pic:pic>
+                    </a:graphicData>
+                  </a:graphic>
+                </wp:inline>
+              </w:drawing>
             </w:r>
           </w:p>
         </w:tc>
@@ -18217,22 +18367,47 @@
               <w:spacing w:before="120"/>
               <w:jc w:val="center"/>
             </w:pPr>
-            <w:r>
-              <w:br/>
-              <w:br/>
-              <w:br/>
-            </w:r>
+            <w:r/>
             <w:r>
               <w:rPr>
                 <w:b/>
                 <w:color w:val="595959"/>
               </w:rPr>
-              <w:t>[Insert Screenshot Here  SS-22]</w:t>
-            </w:r>
-            <w:r>
-              <w:br/>
-              <w:br/>
-              <w:br/>
+            </w:r>
+            <w:r/>
+            <w:r>
+              <w:drawing>
+                <wp:inline xmlns:a="http://schemas.openxmlformats.org/drawingml/2006/main" xmlns:pic="http://schemas.openxmlformats.org/drawingml/2006/picture">
+                  <wp:extent cx="5669280" cy="6720459"/>
+                  <wp:docPr id="8" name="Picture 8"/>
+                  <wp:cNvGraphicFramePr>
+                    <a:graphicFrameLocks noChangeAspect="1"/>
+                  </wp:cNvGraphicFramePr>
+                  <a:graphic>
+                    <a:graphicData uri="http://schemas.openxmlformats.org/drawingml/2006/picture">
+                      <pic:pic>
+                        <pic:nvPicPr>
+                          <pic:cNvPr id="0" name="SS-08_Contact.png"/>
+                          <pic:cNvPicPr/>
+                        </pic:nvPicPr>
+                        <pic:blipFill>
+                          <a:blip r:embed="rId17"/>
+                          <a:stretch>
+                            <a:fillRect/>
+                          </a:stretch>
+                        </pic:blipFill>
+                        <pic:spPr>
+                          <a:xfrm>
+                            <a:off x="0" y="0"/>
+                            <a:ext cx="5669280" cy="6720459"/>
+                          </a:xfrm>
+                          <a:prstGeom prst="rect"/>
+                        </pic:spPr>
+                      </pic:pic>
+                    </a:graphicData>
+                  </a:graphic>
+                </wp:inline>
+              </w:drawing>
             </w:r>
           </w:p>
         </w:tc>
@@ -18472,22 +18647,47 @@
               <w:spacing w:before="120"/>
               <w:jc w:val="center"/>
             </w:pPr>
-            <w:r>
-              <w:br/>
-              <w:br/>
-              <w:br/>
-            </w:r>
+            <w:r/>
             <w:r>
               <w:rPr>
                 <w:b/>
                 <w:color w:val="595959"/>
               </w:rPr>
-              <w:t>[Insert Screenshot Here  SS-25]</w:t>
-            </w:r>
-            <w:r>
-              <w:br/>
-              <w:br/>
-              <w:br/>
+            </w:r>
+            <w:r/>
+            <w:r>
+              <w:drawing>
+                <wp:inline xmlns:a="http://schemas.openxmlformats.org/drawingml/2006/main" xmlns:pic="http://schemas.openxmlformats.org/drawingml/2006/picture">
+                  <wp:extent cx="5669280" cy="5759831"/>
+                  <wp:docPr id="9" name="Picture 9"/>
+                  <wp:cNvGraphicFramePr>
+                    <a:graphicFrameLocks noChangeAspect="1"/>
+                  </wp:cNvGraphicFramePr>
+                  <a:graphic>
+                    <a:graphicData uri="http://schemas.openxmlformats.org/drawingml/2006/picture">
+                      <pic:pic>
+                        <pic:nvPicPr>
+                          <pic:cNvPr id="0" name="SS-09_Messaging.png"/>
+                          <pic:cNvPicPr/>
+                        </pic:nvPicPr>
+                        <pic:blipFill>
+                          <a:blip r:embed="rId18"/>
+                          <a:stretch>
+                            <a:fillRect/>
+                          </a:stretch>
+                        </pic:blipFill>
+                        <pic:spPr>
+                          <a:xfrm>
+                            <a:off x="0" y="0"/>
+                            <a:ext cx="5669280" cy="5759831"/>
+                          </a:xfrm>
+                          <a:prstGeom prst="rect"/>
+                        </pic:spPr>
+                      </pic:pic>
+                    </a:graphicData>
+                  </a:graphic>
+                </wp:inline>
+              </w:drawing>
             </w:r>
           </w:p>
         </w:tc>
@@ -18557,22 +18757,47 @@
               <w:spacing w:before="120"/>
               <w:jc w:val="center"/>
             </w:pPr>
-            <w:r>
-              <w:br/>
-              <w:br/>
-              <w:br/>
-            </w:r>
+            <w:r/>
             <w:r>
               <w:rPr>
                 <w:b/>
                 <w:color w:val="595959"/>
               </w:rPr>
-              <w:t>[Insert Screenshot Here  SS-26]</w:t>
-            </w:r>
-            <w:r>
-              <w:br/>
-              <w:br/>
-              <w:br/>
+            </w:r>
+            <w:r/>
+            <w:r>
+              <w:drawing>
+                <wp:inline xmlns:a="http://schemas.openxmlformats.org/drawingml/2006/main" xmlns:pic="http://schemas.openxmlformats.org/drawingml/2006/picture">
+                  <wp:extent cx="5669280" cy="5759831"/>
+                  <wp:docPr id="10" name="Picture 10"/>
+                  <wp:cNvGraphicFramePr>
+                    <a:graphicFrameLocks noChangeAspect="1"/>
+                  </wp:cNvGraphicFramePr>
+                  <a:graphic>
+                    <a:graphicData uri="http://schemas.openxmlformats.org/drawingml/2006/picture">
+                      <pic:pic>
+                        <pic:nvPicPr>
+                          <pic:cNvPr id="0" name="SS-10_Diin_AI.png"/>
+                          <pic:cNvPicPr/>
+                        </pic:nvPicPr>
+                        <pic:blipFill>
+                          <a:blip r:embed="rId19"/>
+                          <a:stretch>
+                            <a:fillRect/>
+                          </a:stretch>
+                        </pic:blipFill>
+                        <pic:spPr>
+                          <a:xfrm>
+                            <a:off x="0" y="0"/>
+                            <a:ext cx="5669280" cy="5759831"/>
+                          </a:xfrm>
+                          <a:prstGeom prst="rect"/>
+                        </pic:spPr>
+                      </pic:pic>
+                    </a:graphicData>
+                  </a:graphic>
+                </wp:inline>
+              </w:drawing>
             </w:r>
           </w:p>
         </w:tc>
@@ -18812,22 +19037,47 @@
               <w:spacing w:before="120"/>
               <w:jc w:val="center"/>
             </w:pPr>
-            <w:r>
-              <w:br/>
-              <w:br/>
-              <w:br/>
-            </w:r>
+            <w:r/>
             <w:r>
               <w:rPr>
                 <w:b/>
                 <w:color w:val="595959"/>
               </w:rPr>
-              <w:t>[Insert Screenshot Here  SS-29]</w:t>
-            </w:r>
-            <w:r>
-              <w:br/>
-              <w:br/>
-              <w:br/>
+            </w:r>
+            <w:r/>
+            <w:r>
+              <w:drawing>
+                <wp:inline xmlns:a="http://schemas.openxmlformats.org/drawingml/2006/main" xmlns:pic="http://schemas.openxmlformats.org/drawingml/2006/picture">
+                  <wp:extent cx="5669280" cy="5759831"/>
+                  <wp:docPr id="11" name="Picture 11"/>
+                  <wp:cNvGraphicFramePr>
+                    <a:graphicFrameLocks noChangeAspect="1"/>
+                  </wp:cNvGraphicFramePr>
+                  <a:graphic>
+                    <a:graphicData uri="http://schemas.openxmlformats.org/drawingml/2006/picture">
+                      <pic:pic>
+                        <pic:nvPicPr>
+                          <pic:cNvPr id="0" name="SS-09_Messaging.png"/>
+                          <pic:cNvPicPr/>
+                        </pic:nvPicPr>
+                        <pic:blipFill>
+                          <a:blip r:embed="rId18"/>
+                          <a:stretch>
+                            <a:fillRect/>
+                          </a:stretch>
+                        </pic:blipFill>
+                        <pic:spPr>
+                          <a:xfrm>
+                            <a:off x="0" y="0"/>
+                            <a:ext cx="5669280" cy="5759831"/>
+                          </a:xfrm>
+                          <a:prstGeom prst="rect"/>
+                        </pic:spPr>
+                      </pic:pic>
+                    </a:graphicData>
+                  </a:graphic>
+                </wp:inline>
+              </w:drawing>
             </w:r>
           </w:p>
         </w:tc>
@@ -18897,22 +19147,47 @@
               <w:spacing w:before="120"/>
               <w:jc w:val="center"/>
             </w:pPr>
-            <w:r>
-              <w:br/>
-              <w:br/>
-              <w:br/>
-            </w:r>
+            <w:r/>
             <w:r>
               <w:rPr>
                 <w:b/>
                 <w:color w:val="595959"/>
               </w:rPr>
-              <w:t>[Insert Screenshot Here  SS-30]</w:t>
-            </w:r>
-            <w:r>
-              <w:br/>
-              <w:br/>
-              <w:br/>
+            </w:r>
+            <w:r/>
+            <w:r>
+              <w:drawing>
+                <wp:inline xmlns:a="http://schemas.openxmlformats.org/drawingml/2006/main" xmlns:pic="http://schemas.openxmlformats.org/drawingml/2006/picture">
+                  <wp:extent cx="5669280" cy="5759831"/>
+                  <wp:docPr id="12" name="Picture 12"/>
+                  <wp:cNvGraphicFramePr>
+                    <a:graphicFrameLocks noChangeAspect="1"/>
+                  </wp:cNvGraphicFramePr>
+                  <a:graphic>
+                    <a:graphicData uri="http://schemas.openxmlformats.org/drawingml/2006/picture">
+                      <pic:pic>
+                        <pic:nvPicPr>
+                          <pic:cNvPr id="0" name="SS-13_404.png"/>
+                          <pic:cNvPicPr/>
+                        </pic:nvPicPr>
+                        <pic:blipFill>
+                          <a:blip r:embed="rId20"/>
+                          <a:stretch>
+                            <a:fillRect/>
+                          </a:stretch>
+                        </pic:blipFill>
+                        <pic:spPr>
+                          <a:xfrm>
+                            <a:off x="0" y="0"/>
+                            <a:ext cx="5669280" cy="5759831"/>
+                          </a:xfrm>
+                          <a:prstGeom prst="rect"/>
+                        </pic:spPr>
+                      </pic:pic>
+                    </a:graphicData>
+                  </a:graphic>
+                </wp:inline>
+              </w:drawing>
             </w:r>
           </w:p>
         </w:tc>
@@ -18953,6 +19228,19 @@
       </w:r>
       <w:r>
         <w:t xml:space="preserve"> TC-30 — 404 Page / Invalid Route</w:t>
+      </w:r>
+    </w:p>
+    <w:p>
+      <w:pPr>
+        <w:pStyle w:val="Heading1"/>
+      </w:pPr>
+      <w:r>
+        <w:t>Local Execution Note</w:t>
+      </w:r>
+    </w:p>
+    <w:p>
+      <w:r>
+        <w:t>Local execution completed on 15 September 2026: Laravel unit test, React production build, API route inspection, migration installation, Python AST parsing, public API smoke checks, and frontend browser rendering were executed. Embedded screenshots document the locally rendered public pages and representative validation/error states. Authenticated registration, email delivery, Cloudinary upload, SSLCommerz callbacks, and the external AI response service were not marked as successful because those external interactions were not reproducibly available in this environment.</w:t>
       </w:r>
     </w:p>
     <w:sectPr>

</xml_diff>